<commit_message>
Task 6: results workflow with append, merge and percentage
</commit_message>
<xml_diff>
--- a/235137 DS Lab 07.docx
+++ b/235137 DS Lab 07.docx
@@ -487,7 +487,6 @@
         </w:rPr>
         <w:t xml:space="preserve">               </w:t>
       </w:r>
-      <w:proofErr w:type="gramStart"/>
       <w:r>
         <w:rPr>
           <w:rFonts w:ascii="Times New Roman" w:eastAsia="Sitka Subheading" w:hAnsi="Times New Roman" w:cs="Times New Roman"/>
@@ -502,16 +501,7 @@
           <w:color w:val="0070C0"/>
           <w:sz w:val="36"/>
         </w:rPr>
-        <w:t>235137</w:t>
-      </w:r>
-      <w:proofErr w:type="gramEnd"/>
-      <w:r>
-        <w:rPr>
-          <w:rFonts w:ascii="Times New Roman" w:hAnsi="Times New Roman" w:cs="Times New Roman"/>
-          <w:color w:val="0070C0"/>
-          <w:sz w:val="36"/>
-        </w:rPr>
-        <w:t xml:space="preserve"> </w:t>
+        <w:t xml:space="preserve">235137 </w:t>
       </w:r>
     </w:p>
     <w:p>
@@ -673,6 +663,7 @@
           <w:rFonts w:ascii="Times New Roman" w:hAnsi="Times New Roman" w:cs="Times New Roman"/>
           <w:b/>
           <w:bCs/>
+          <w:noProof/>
           <w:sz w:val="28"/>
           <w:szCs w:val="28"/>
         </w:rPr>
@@ -748,6 +739,7 @@
           <w:rFonts w:ascii="Times New Roman" w:hAnsi="Times New Roman" w:cs="Times New Roman"/>
           <w:b/>
           <w:bCs/>
+          <w:noProof/>
           <w:sz w:val="28"/>
           <w:szCs w:val="28"/>
         </w:rPr>
@@ -834,6 +826,7 @@
           <w:rFonts w:ascii="Times New Roman" w:hAnsi="Times New Roman" w:cs="Times New Roman"/>
           <w:b/>
           <w:bCs/>
+          <w:noProof/>
           <w:sz w:val="28"/>
           <w:szCs w:val="28"/>
         </w:rPr>
@@ -919,6 +912,7 @@
           <w:rFonts w:ascii="Times New Roman" w:hAnsi="Times New Roman" w:cs="Times New Roman"/>
           <w:b/>
           <w:bCs/>
+          <w:noProof/>
           <w:sz w:val="28"/>
           <w:szCs w:val="28"/>
         </w:rPr>
@@ -995,6 +989,7 @@
           <w:rFonts w:ascii="Times New Roman" w:hAnsi="Times New Roman" w:cs="Times New Roman"/>
           <w:b/>
           <w:bCs/>
+          <w:noProof/>
           <w:sz w:val="28"/>
           <w:szCs w:val="28"/>
         </w:rPr>
@@ -1050,6 +1045,7 @@
           <w:rFonts w:ascii="Times New Roman" w:hAnsi="Times New Roman" w:cs="Times New Roman"/>
           <w:b/>
           <w:bCs/>
+          <w:noProof/>
           <w:sz w:val="28"/>
           <w:szCs w:val="28"/>
         </w:rPr>
@@ -1138,6 +1134,7 @@
           <w:rFonts w:ascii="Times New Roman" w:hAnsi="Times New Roman" w:cs="Times New Roman"/>
           <w:b/>
           <w:bCs/>
+          <w:noProof/>
           <w:sz w:val="32"/>
           <w:szCs w:val="32"/>
         </w:rPr>
@@ -1193,6 +1190,7 @@
           <w:rFonts w:ascii="Times New Roman" w:hAnsi="Times New Roman" w:cs="Times New Roman"/>
           <w:b/>
           <w:bCs/>
+          <w:noProof/>
           <w:sz w:val="32"/>
           <w:szCs w:val="32"/>
         </w:rPr>
@@ -1248,6 +1246,7 @@
           <w:rFonts w:ascii="Times New Roman" w:hAnsi="Times New Roman" w:cs="Times New Roman"/>
           <w:b/>
           <w:bCs/>
+          <w:noProof/>
           <w:sz w:val="28"/>
           <w:szCs w:val="28"/>
         </w:rPr>
@@ -1318,44 +1317,25 @@
           <w:sz w:val="32"/>
           <w:szCs w:val="32"/>
         </w:rPr>
-        <w:t>Task 0</w:t>
-      </w:r>
-      <w:r>
-        <w:rPr>
-          <w:rFonts w:ascii="Times New Roman" w:hAnsi="Times New Roman" w:cs="Times New Roman"/>
-          <w:b/>
-          <w:bCs/>
-          <w:sz w:val="32"/>
-          <w:szCs w:val="32"/>
-        </w:rPr>
-        <w:t>2</w:t>
-      </w:r>
-      <w:r>
-        <w:rPr>
-          <w:rFonts w:ascii="Times New Roman" w:hAnsi="Times New Roman" w:cs="Times New Roman"/>
-          <w:b/>
-          <w:bCs/>
-          <w:sz w:val="32"/>
-          <w:szCs w:val="32"/>
-        </w:rPr>
-        <w:t>:</w:t>
-      </w:r>
-    </w:p>
-    <w:p>
-      <w:pPr>
-        <w:rPr>
-          <w:rFonts w:ascii="Times New Roman" w:hAnsi="Times New Roman" w:cs="Times New Roman"/>
-          <w:b/>
-          <w:bCs/>
-          <w:sz w:val="32"/>
-          <w:szCs w:val="32"/>
-        </w:rPr>
-      </w:pPr>
-      <w:r>
-        <w:rPr>
-          <w:rFonts w:ascii="Times New Roman" w:hAnsi="Times New Roman" w:cs="Times New Roman"/>
-          <w:b/>
-          <w:bCs/>
+        <w:t>Task 02:</w:t>
+      </w:r>
+    </w:p>
+    <w:p>
+      <w:pPr>
+        <w:rPr>
+          <w:rFonts w:ascii="Times New Roman" w:hAnsi="Times New Roman" w:cs="Times New Roman"/>
+          <w:b/>
+          <w:bCs/>
+          <w:sz w:val="32"/>
+          <w:szCs w:val="32"/>
+        </w:rPr>
+      </w:pPr>
+      <w:r>
+        <w:rPr>
+          <w:rFonts w:ascii="Times New Roman" w:hAnsi="Times New Roman" w:cs="Times New Roman"/>
+          <w:b/>
+          <w:bCs/>
+          <w:noProof/>
           <w:sz w:val="32"/>
           <w:szCs w:val="32"/>
         </w:rPr>
@@ -1432,6 +1412,7 @@
           <w:rFonts w:ascii="Times New Roman" w:hAnsi="Times New Roman" w:cs="Times New Roman"/>
           <w:b/>
           <w:bCs/>
+          <w:noProof/>
           <w:sz w:val="32"/>
           <w:szCs w:val="32"/>
         </w:rPr>
@@ -1507,6 +1488,7 @@
           <w:rFonts w:ascii="Times New Roman" w:hAnsi="Times New Roman" w:cs="Times New Roman"/>
           <w:b/>
           <w:bCs/>
+          <w:noProof/>
           <w:sz w:val="32"/>
           <w:szCs w:val="32"/>
         </w:rPr>
@@ -1562,6 +1544,7 @@
           <w:rFonts w:ascii="Times New Roman" w:hAnsi="Times New Roman" w:cs="Times New Roman"/>
           <w:b/>
           <w:bCs/>
+          <w:noProof/>
           <w:sz w:val="28"/>
           <w:szCs w:val="28"/>
         </w:rPr>
@@ -1618,6 +1601,7 @@
           <w:rFonts w:ascii="Times New Roman" w:hAnsi="Times New Roman" w:cs="Times New Roman"/>
           <w:b/>
           <w:bCs/>
+          <w:noProof/>
           <w:sz w:val="28"/>
           <w:szCs w:val="28"/>
         </w:rPr>
@@ -1710,27 +1694,7 @@
           <w:szCs w:val="32"/>
         </w:rPr>
         <w:lastRenderedPageBreak/>
-        <w:t>Task 0</w:t>
-      </w:r>
-      <w:r>
-        <w:rPr>
-          <w:rFonts w:ascii="Times New Roman" w:hAnsi="Times New Roman" w:cs="Times New Roman"/>
-          <w:b/>
-          <w:bCs/>
-          <w:sz w:val="32"/>
-          <w:szCs w:val="32"/>
-        </w:rPr>
-        <w:t>3</w:t>
-      </w:r>
-      <w:r>
-        <w:rPr>
-          <w:rFonts w:ascii="Times New Roman" w:hAnsi="Times New Roman" w:cs="Times New Roman"/>
-          <w:b/>
-          <w:bCs/>
-          <w:sz w:val="32"/>
-          <w:szCs w:val="32"/>
-        </w:rPr>
-        <w:t>:</w:t>
+        <w:t>Task 03:</w:t>
       </w:r>
     </w:p>
     <w:p>
@@ -1829,6 +1793,7 @@
           <w:rFonts w:ascii="Times New Roman" w:hAnsi="Times New Roman" w:cs="Times New Roman"/>
           <w:b/>
           <w:bCs/>
+          <w:noProof/>
           <w:sz w:val="32"/>
           <w:szCs w:val="32"/>
         </w:rPr>
@@ -1917,6 +1882,7 @@
           <w:rFonts w:ascii="Times New Roman" w:hAnsi="Times New Roman" w:cs="Times New Roman"/>
           <w:b/>
           <w:bCs/>
+          <w:noProof/>
           <w:sz w:val="28"/>
           <w:szCs w:val="28"/>
         </w:rPr>
@@ -1983,6 +1949,7 @@
           <w:rFonts w:ascii="Times New Roman" w:hAnsi="Times New Roman" w:cs="Times New Roman"/>
           <w:b/>
           <w:bCs/>
+          <w:noProof/>
           <w:sz w:val="28"/>
           <w:szCs w:val="28"/>
         </w:rPr>
@@ -2038,6 +2005,7 @@
           <w:rFonts w:ascii="Times New Roman" w:hAnsi="Times New Roman" w:cs="Times New Roman"/>
           <w:b/>
           <w:bCs/>
+          <w:noProof/>
           <w:sz w:val="28"/>
           <w:szCs w:val="28"/>
         </w:rPr>
@@ -2108,44 +2076,25 @@
           <w:sz w:val="32"/>
           <w:szCs w:val="32"/>
         </w:rPr>
-        <w:t>Task 0</w:t>
-      </w:r>
-      <w:r>
-        <w:rPr>
-          <w:rFonts w:ascii="Times New Roman" w:hAnsi="Times New Roman" w:cs="Times New Roman"/>
-          <w:b/>
-          <w:bCs/>
-          <w:sz w:val="32"/>
-          <w:szCs w:val="32"/>
-        </w:rPr>
-        <w:t>4</w:t>
-      </w:r>
-      <w:r>
-        <w:rPr>
-          <w:rFonts w:ascii="Times New Roman" w:hAnsi="Times New Roman" w:cs="Times New Roman"/>
-          <w:b/>
-          <w:bCs/>
-          <w:sz w:val="32"/>
-          <w:szCs w:val="32"/>
-        </w:rPr>
-        <w:t>:</w:t>
-      </w:r>
-    </w:p>
-    <w:p>
-      <w:pPr>
-        <w:rPr>
-          <w:rFonts w:ascii="Times New Roman" w:hAnsi="Times New Roman" w:cs="Times New Roman"/>
-          <w:b/>
-          <w:bCs/>
-          <w:sz w:val="32"/>
-          <w:szCs w:val="32"/>
-        </w:rPr>
-      </w:pPr>
-      <w:r>
-        <w:rPr>
-          <w:rFonts w:ascii="Times New Roman" w:hAnsi="Times New Roman" w:cs="Times New Roman"/>
-          <w:b/>
-          <w:bCs/>
+        <w:t>Task 04:</w:t>
+      </w:r>
+    </w:p>
+    <w:p>
+      <w:pPr>
+        <w:rPr>
+          <w:rFonts w:ascii="Times New Roman" w:hAnsi="Times New Roman" w:cs="Times New Roman"/>
+          <w:b/>
+          <w:bCs/>
+          <w:sz w:val="32"/>
+          <w:szCs w:val="32"/>
+        </w:rPr>
+      </w:pPr>
+      <w:r>
+        <w:rPr>
+          <w:rFonts w:ascii="Times New Roman" w:hAnsi="Times New Roman" w:cs="Times New Roman"/>
+          <w:b/>
+          <w:bCs/>
+          <w:noProof/>
           <w:sz w:val="32"/>
           <w:szCs w:val="32"/>
         </w:rPr>
@@ -2202,6 +2151,7 @@
           <w:rFonts w:ascii="Times New Roman" w:hAnsi="Times New Roman" w:cs="Times New Roman"/>
           <w:b/>
           <w:bCs/>
+          <w:noProof/>
           <w:sz w:val="32"/>
           <w:szCs w:val="32"/>
         </w:rPr>
@@ -2261,29 +2211,7 @@
           <w:sz w:val="28"/>
           <w:szCs w:val="28"/>
         </w:rPr>
-        <w:t>Final Data (</w:t>
-      </w:r>
-      <w:proofErr w:type="spellStart"/>
-      <w:r>
-        <w:rPr>
-          <w:rFonts w:ascii="Times New Roman" w:hAnsi="Times New Roman" w:cs="Times New Roman"/>
-          <w:b/>
-          <w:bCs/>
-          <w:sz w:val="28"/>
-          <w:szCs w:val="28"/>
-        </w:rPr>
-        <w:t>Enroll_Details</w:t>
-      </w:r>
-      <w:proofErr w:type="spellEnd"/>
-      <w:r>
-        <w:rPr>
-          <w:rFonts w:ascii="Times New Roman" w:hAnsi="Times New Roman" w:cs="Times New Roman"/>
-          <w:b/>
-          <w:bCs/>
-          <w:sz w:val="28"/>
-          <w:szCs w:val="28"/>
-        </w:rPr>
-        <w:t>):</w:t>
+        <w:t>Final Data (Enroll_Details):</w:t>
       </w:r>
       <w:r>
         <w:rPr>
@@ -2300,6 +2228,7 @@
           <w:rFonts w:ascii="Times New Roman" w:hAnsi="Times New Roman" w:cs="Times New Roman"/>
           <w:b/>
           <w:bCs/>
+          <w:noProof/>
           <w:sz w:val="32"/>
           <w:szCs w:val="32"/>
         </w:rPr>
@@ -2355,6 +2284,7 @@
           <w:rFonts w:ascii="Times New Roman" w:hAnsi="Times New Roman" w:cs="Times New Roman"/>
           <w:b/>
           <w:bCs/>
+          <w:noProof/>
           <w:sz w:val="32"/>
           <w:szCs w:val="32"/>
         </w:rPr>
@@ -2406,99 +2336,379 @@
           <w:szCs w:val="32"/>
         </w:rPr>
       </w:pPr>
-      <w:r>
-        <w:rPr>
-          <w:rFonts w:ascii="Times New Roman" w:hAnsi="Times New Roman" w:cs="Times New Roman"/>
-          <w:b/>
-          <w:bCs/>
-          <w:sz w:val="32"/>
-          <w:szCs w:val="32"/>
-        </w:rPr>
-        <w:t>Task 0</w:t>
-      </w:r>
-      <w:r>
-        <w:rPr>
-          <w:rFonts w:ascii="Times New Roman" w:hAnsi="Times New Roman" w:cs="Times New Roman"/>
-          <w:b/>
-          <w:bCs/>
-          <w:sz w:val="32"/>
-          <w:szCs w:val="32"/>
-        </w:rPr>
-        <w:t>5</w:t>
-      </w:r>
-      <w:r>
-        <w:rPr>
-          <w:rFonts w:ascii="Times New Roman" w:hAnsi="Times New Roman" w:cs="Times New Roman"/>
-          <w:b/>
-          <w:bCs/>
-          <w:sz w:val="32"/>
-          <w:szCs w:val="32"/>
-        </w:rPr>
-        <w:t>:</w:t>
-      </w:r>
-    </w:p>
-    <w:p>
-      <w:pPr>
-        <w:rPr>
-          <w:rFonts w:ascii="Times New Roman" w:hAnsi="Times New Roman" w:cs="Times New Roman"/>
-          <w:b/>
-          <w:bCs/>
-          <w:sz w:val="32"/>
-          <w:szCs w:val="32"/>
-        </w:rPr>
-      </w:pPr>
-    </w:p>
-    <w:p>
-      <w:pPr>
-        <w:rPr>
-          <w:rFonts w:ascii="Times New Roman" w:hAnsi="Times New Roman" w:cs="Times New Roman"/>
-          <w:b/>
-          <w:bCs/>
-          <w:sz w:val="32"/>
-          <w:szCs w:val="32"/>
-        </w:rPr>
-      </w:pPr>
-      <w:r>
-        <w:rPr>
-          <w:rFonts w:ascii="Times New Roman" w:hAnsi="Times New Roman" w:cs="Times New Roman"/>
-          <w:b/>
-          <w:bCs/>
-          <w:sz w:val="32"/>
-          <w:szCs w:val="32"/>
-        </w:rPr>
-        <w:t>Task 0</w:t>
-      </w:r>
-      <w:r>
-        <w:rPr>
-          <w:rFonts w:ascii="Times New Roman" w:hAnsi="Times New Roman" w:cs="Times New Roman"/>
-          <w:b/>
-          <w:bCs/>
-          <w:sz w:val="32"/>
-          <w:szCs w:val="32"/>
-        </w:rPr>
-        <w:t>6</w:t>
-      </w:r>
-      <w:r>
-        <w:rPr>
-          <w:rFonts w:ascii="Times New Roman" w:hAnsi="Times New Roman" w:cs="Times New Roman"/>
-          <w:b/>
-          <w:bCs/>
-          <w:sz w:val="32"/>
-          <w:szCs w:val="32"/>
-        </w:rPr>
-        <w:t>:</w:t>
-      </w:r>
-    </w:p>
-    <w:p>
-      <w:pPr>
-        <w:rPr>
-          <w:rFonts w:ascii="Times New Roman" w:hAnsi="Times New Roman" w:cs="Times New Roman"/>
-          <w:b/>
-          <w:bCs/>
-          <w:sz w:val="28"/>
-          <w:szCs w:val="28"/>
-        </w:rPr>
-      </w:pPr>
+    </w:p>
+    <w:p>
+      <w:pPr>
+        <w:rPr>
+          <w:rFonts w:ascii="Times New Roman" w:hAnsi="Times New Roman" w:cs="Times New Roman"/>
+          <w:b/>
+          <w:bCs/>
+          <w:sz w:val="32"/>
+          <w:szCs w:val="32"/>
+        </w:rPr>
+      </w:pPr>
+      <w:r>
+        <w:rPr>
+          <w:rFonts w:ascii="Times New Roman" w:hAnsi="Times New Roman" w:cs="Times New Roman"/>
+          <w:b/>
+          <w:bCs/>
+          <w:sz w:val="32"/>
+          <w:szCs w:val="32"/>
+        </w:rPr>
+        <w:t>Task 05:</w:t>
+      </w:r>
+    </w:p>
+    <w:p>
+      <w:pPr>
+        <w:rPr>
+          <w:rFonts w:ascii="Times New Roman" w:hAnsi="Times New Roman" w:cs="Times New Roman"/>
+          <w:b/>
+          <w:bCs/>
+          <w:sz w:val="32"/>
+          <w:szCs w:val="32"/>
+        </w:rPr>
+      </w:pPr>
+      <w:r>
+        <w:rPr>
+          <w:rFonts w:ascii="Times New Roman" w:hAnsi="Times New Roman" w:cs="Times New Roman"/>
+          <w:b/>
+          <w:bCs/>
+          <w:sz w:val="28"/>
+          <w:szCs w:val="28"/>
+        </w:rPr>
+        <w:t>Final Data:</w:t>
+      </w:r>
+      <w:r>
+        <w:rPr>
+          <w:rFonts w:ascii="Times New Roman" w:hAnsi="Times New Roman" w:cs="Times New Roman"/>
+          <w:b/>
+          <w:bCs/>
+          <w:sz w:val="32"/>
+          <w:szCs w:val="32"/>
+        </w:rPr>
+        <w:br/>
+      </w:r>
+      <w:r>
+        <w:rPr>
+          <w:rFonts w:ascii="Times New Roman" w:hAnsi="Times New Roman" w:cs="Times New Roman"/>
+          <w:b/>
+          <w:bCs/>
+          <w:noProof/>
+          <w:sz w:val="32"/>
+          <w:szCs w:val="32"/>
+        </w:rPr>
+        <w:drawing>
+          <wp:inline distT="0" distB="0" distL="0" distR="0" wp14:anchorId="51F8B1AF" wp14:editId="67969C44">
+            <wp:extent cx="5943600" cy="1235075"/>
+            <wp:effectExtent l="0" t="0" r="0" b="3175"/>
+            <wp:docPr id="1761422474" name="Picture 1"/>
+            <wp:cNvGraphicFramePr>
+              <a:graphicFrameLocks xmlns:a="http://schemas.openxmlformats.org/drawingml/2006/main" noChangeAspect="1"/>
+            </wp:cNvGraphicFramePr>
+            <a:graphic xmlns:a="http://schemas.openxmlformats.org/drawingml/2006/main">
+              <a:graphicData uri="http://schemas.openxmlformats.org/drawingml/2006/picture">
+                <pic:pic xmlns:pic="http://schemas.openxmlformats.org/drawingml/2006/picture">
+                  <pic:nvPicPr>
+                    <pic:cNvPr id="1761422474" name=""/>
+                    <pic:cNvPicPr/>
+                  </pic:nvPicPr>
+                  <pic:blipFill>
+                    <a:blip r:embed="rId28"/>
+                    <a:stretch>
+                      <a:fillRect/>
+                    </a:stretch>
+                  </pic:blipFill>
+                  <pic:spPr>
+                    <a:xfrm>
+                      <a:off x="0" y="0"/>
+                      <a:ext cx="5943600" cy="1235075"/>
+                    </a:xfrm>
+                    <a:prstGeom prst="rect">
+                      <a:avLst/>
+                    </a:prstGeom>
+                  </pic:spPr>
+                </pic:pic>
+              </a:graphicData>
+            </a:graphic>
+          </wp:inline>
+        </w:drawing>
+      </w:r>
+    </w:p>
+    <w:p>
+      <w:pPr>
+        <w:rPr>
+          <w:rFonts w:ascii="Times New Roman" w:hAnsi="Times New Roman" w:cs="Times New Roman"/>
+          <w:b/>
+          <w:bCs/>
+          <w:sz w:val="32"/>
+          <w:szCs w:val="32"/>
+        </w:rPr>
+      </w:pPr>
+      <w:r>
+        <w:rPr>
+          <w:rFonts w:ascii="Times New Roman" w:hAnsi="Times New Roman" w:cs="Times New Roman"/>
+          <w:b/>
+          <w:bCs/>
+          <w:noProof/>
+          <w:sz w:val="32"/>
+          <w:szCs w:val="32"/>
+        </w:rPr>
+        <w:lastRenderedPageBreak/>
+        <w:drawing>
+          <wp:inline distT="0" distB="0" distL="0" distR="0" wp14:anchorId="6396BABA" wp14:editId="288652C1">
+            <wp:extent cx="3877216" cy="4305901"/>
+            <wp:effectExtent l="0" t="0" r="9525" b="0"/>
+            <wp:docPr id="904322788" name="Picture 1"/>
+            <wp:cNvGraphicFramePr>
+              <a:graphicFrameLocks xmlns:a="http://schemas.openxmlformats.org/drawingml/2006/main" noChangeAspect="1"/>
+            </wp:cNvGraphicFramePr>
+            <a:graphic xmlns:a="http://schemas.openxmlformats.org/drawingml/2006/main">
+              <a:graphicData uri="http://schemas.openxmlformats.org/drawingml/2006/picture">
+                <pic:pic xmlns:pic="http://schemas.openxmlformats.org/drawingml/2006/picture">
+                  <pic:nvPicPr>
+                    <pic:cNvPr id="904322788" name=""/>
+                    <pic:cNvPicPr/>
+                  </pic:nvPicPr>
+                  <pic:blipFill>
+                    <a:blip r:embed="rId29"/>
+                    <a:stretch>
+                      <a:fillRect/>
+                    </a:stretch>
+                  </pic:blipFill>
+                  <pic:spPr>
+                    <a:xfrm>
+                      <a:off x="0" y="0"/>
+                      <a:ext cx="3877216" cy="4305901"/>
+                    </a:xfrm>
+                    <a:prstGeom prst="rect">
+                      <a:avLst/>
+                    </a:prstGeom>
+                  </pic:spPr>
+                </pic:pic>
+              </a:graphicData>
+            </a:graphic>
+          </wp:inline>
+        </w:drawing>
+      </w:r>
+    </w:p>
+    <w:p>
+      <w:pPr>
+        <w:rPr>
+          <w:rFonts w:ascii="Times New Roman" w:hAnsi="Times New Roman" w:cs="Times New Roman"/>
+          <w:b/>
+          <w:bCs/>
+          <w:sz w:val="32"/>
+          <w:szCs w:val="32"/>
+        </w:rPr>
+      </w:pPr>
+      <w:r>
+        <w:rPr>
+          <w:rFonts w:ascii="Times New Roman" w:hAnsi="Times New Roman" w:cs="Times New Roman"/>
+          <w:b/>
+          <w:bCs/>
+          <w:noProof/>
+          <w:sz w:val="32"/>
+          <w:szCs w:val="32"/>
+        </w:rPr>
+        <w:drawing>
+          <wp:inline distT="0" distB="0" distL="0" distR="0" wp14:anchorId="45293351" wp14:editId="58A28144">
+            <wp:extent cx="4791744" cy="3143689"/>
+            <wp:effectExtent l="0" t="0" r="8890" b="0"/>
+            <wp:docPr id="1951066418" name="Picture 1"/>
+            <wp:cNvGraphicFramePr>
+              <a:graphicFrameLocks xmlns:a="http://schemas.openxmlformats.org/drawingml/2006/main" noChangeAspect="1"/>
+            </wp:cNvGraphicFramePr>
+            <a:graphic xmlns:a="http://schemas.openxmlformats.org/drawingml/2006/main">
+              <a:graphicData uri="http://schemas.openxmlformats.org/drawingml/2006/picture">
+                <pic:pic xmlns:pic="http://schemas.openxmlformats.org/drawingml/2006/picture">
+                  <pic:nvPicPr>
+                    <pic:cNvPr id="1951066418" name=""/>
+                    <pic:cNvPicPr/>
+                  </pic:nvPicPr>
+                  <pic:blipFill>
+                    <a:blip r:embed="rId30"/>
+                    <a:stretch>
+                      <a:fillRect/>
+                    </a:stretch>
+                  </pic:blipFill>
+                  <pic:spPr>
+                    <a:xfrm>
+                      <a:off x="0" y="0"/>
+                      <a:ext cx="4791744" cy="3143689"/>
+                    </a:xfrm>
+                    <a:prstGeom prst="rect">
+                      <a:avLst/>
+                    </a:prstGeom>
+                  </pic:spPr>
+                </pic:pic>
+              </a:graphicData>
+            </a:graphic>
+          </wp:inline>
+        </w:drawing>
+      </w:r>
+    </w:p>
+    <w:p>
+      <w:pPr>
+        <w:rPr>
+          <w:rFonts w:ascii="Times New Roman" w:hAnsi="Times New Roman" w:cs="Times New Roman"/>
+          <w:b/>
+          <w:bCs/>
+          <w:sz w:val="32"/>
+          <w:szCs w:val="32"/>
+        </w:rPr>
+      </w:pPr>
+    </w:p>
+    <w:p>
+      <w:pPr>
+        <w:rPr>
+          <w:rFonts w:ascii="Times New Roman" w:hAnsi="Times New Roman" w:cs="Times New Roman"/>
+          <w:b/>
+          <w:bCs/>
+          <w:sz w:val="28"/>
+          <w:szCs w:val="28"/>
+        </w:rPr>
+      </w:pPr>
+      <w:r>
+        <w:rPr>
+          <w:rFonts w:ascii="Times New Roman" w:hAnsi="Times New Roman" w:cs="Times New Roman"/>
+          <w:b/>
+          <w:bCs/>
+          <w:sz w:val="32"/>
+          <w:szCs w:val="32"/>
+        </w:rPr>
+        <w:lastRenderedPageBreak/>
+        <w:t>Task 06:</w:t>
+      </w:r>
+      <w:r>
+        <w:rPr>
+          <w:rFonts w:ascii="Times New Roman" w:hAnsi="Times New Roman" w:cs="Times New Roman"/>
+          <w:b/>
+          <w:bCs/>
+          <w:sz w:val="32"/>
+          <w:szCs w:val="32"/>
+        </w:rPr>
+        <w:br/>
+      </w:r>
+      <w:r>
+        <w:rPr>
+          <w:rFonts w:ascii="Times New Roman" w:hAnsi="Times New Roman" w:cs="Times New Roman"/>
+          <w:b/>
+          <w:bCs/>
+          <w:sz w:val="28"/>
+          <w:szCs w:val="28"/>
+        </w:rPr>
+        <w:t>Final Result:</w:t>
+      </w:r>
+    </w:p>
+    <w:p>
+      <w:pPr>
+        <w:rPr>
+          <w:rFonts w:ascii="Times New Roman" w:hAnsi="Times New Roman" w:cs="Times New Roman"/>
+          <w:b/>
+          <w:bCs/>
+          <w:sz w:val="32"/>
+          <w:szCs w:val="32"/>
+        </w:rPr>
+      </w:pPr>
+      <w:r>
+        <w:rPr>
+          <w:rFonts w:ascii="Times New Roman" w:hAnsi="Times New Roman" w:cs="Times New Roman"/>
+          <w:b/>
+          <w:bCs/>
+          <w:sz w:val="32"/>
+          <w:szCs w:val="32"/>
+        </w:rPr>
+        <w:drawing>
+          <wp:inline distT="0" distB="0" distL="0" distR="0" wp14:anchorId="2248F48E" wp14:editId="6A8E9B80">
+            <wp:extent cx="5943600" cy="2347595"/>
+            <wp:effectExtent l="0" t="0" r="0" b="0"/>
+            <wp:docPr id="823144940" name="Picture 1"/>
+            <wp:cNvGraphicFramePr>
+              <a:graphicFrameLocks xmlns:a="http://schemas.openxmlformats.org/drawingml/2006/main" noChangeAspect="1"/>
+            </wp:cNvGraphicFramePr>
+            <a:graphic xmlns:a="http://schemas.openxmlformats.org/drawingml/2006/main">
+              <a:graphicData uri="http://schemas.openxmlformats.org/drawingml/2006/picture">
+                <pic:pic xmlns:pic="http://schemas.openxmlformats.org/drawingml/2006/picture">
+                  <pic:nvPicPr>
+                    <pic:cNvPr id="823144940" name=""/>
+                    <pic:cNvPicPr/>
+                  </pic:nvPicPr>
+                  <pic:blipFill>
+                    <a:blip r:embed="rId31"/>
+                    <a:stretch>
+                      <a:fillRect/>
+                    </a:stretch>
+                  </pic:blipFill>
+                  <pic:spPr>
+                    <a:xfrm>
+                      <a:off x="0" y="0"/>
+                      <a:ext cx="5943600" cy="2347595"/>
+                    </a:xfrm>
+                    <a:prstGeom prst="rect">
+                      <a:avLst/>
+                    </a:prstGeom>
+                  </pic:spPr>
+                </pic:pic>
+              </a:graphicData>
+            </a:graphic>
+          </wp:inline>
+        </w:drawing>
+      </w:r>
+    </w:p>
+    <w:p>
+      <w:pPr>
+        <w:rPr>
+          <w:rFonts w:ascii="Times New Roman" w:hAnsi="Times New Roman" w:cs="Times New Roman"/>
+          <w:b/>
+          <w:bCs/>
+          <w:sz w:val="32"/>
+          <w:szCs w:val="32"/>
+        </w:rPr>
+      </w:pPr>
+      <w:r>
+        <w:rPr>
+          <w:rFonts w:ascii="Times New Roman" w:hAnsi="Times New Roman" w:cs="Times New Roman"/>
+          <w:b/>
+          <w:bCs/>
+          <w:sz w:val="32"/>
+          <w:szCs w:val="32"/>
+        </w:rPr>
+        <w:drawing>
+          <wp:inline distT="0" distB="0" distL="0" distR="0" wp14:anchorId="14641A6F" wp14:editId="5F56BE82">
+            <wp:extent cx="4020111" cy="2838846"/>
+            <wp:effectExtent l="0" t="0" r="0" b="0"/>
+            <wp:docPr id="1894935003" name="Picture 1"/>
+            <wp:cNvGraphicFramePr>
+              <a:graphicFrameLocks xmlns:a="http://schemas.openxmlformats.org/drawingml/2006/main" noChangeAspect="1"/>
+            </wp:cNvGraphicFramePr>
+            <a:graphic xmlns:a="http://schemas.openxmlformats.org/drawingml/2006/main">
+              <a:graphicData uri="http://schemas.openxmlformats.org/drawingml/2006/picture">
+                <pic:pic xmlns:pic="http://schemas.openxmlformats.org/drawingml/2006/picture">
+                  <pic:nvPicPr>
+                    <pic:cNvPr id="1894935003" name=""/>
+                    <pic:cNvPicPr/>
+                  </pic:nvPicPr>
+                  <pic:blipFill>
+                    <a:blip r:embed="rId32"/>
+                    <a:stretch>
+                      <a:fillRect/>
+                    </a:stretch>
+                  </pic:blipFill>
+                  <pic:spPr>
+                    <a:xfrm>
+                      <a:off x="0" y="0"/>
+                      <a:ext cx="4020111" cy="2838846"/>
+                    </a:xfrm>
+                    <a:prstGeom prst="rect">
+                      <a:avLst/>
+                    </a:prstGeom>
+                  </pic:spPr>
+                </pic:pic>
+              </a:graphicData>
+            </a:graphic>
+          </wp:inline>
+        </w:drawing>
+      </w:r>
     </w:p>
     <w:p>
       <w:pPr>
@@ -3130,6 +3340,7 @@
   <w:style w:type="character" w:default="1" w:styleId="DefaultParagraphFont">
     <w:name w:val="Default Paragraph Font"/>
     <w:uiPriority w:val="1"/>
+    <w:semiHidden/>
     <w:unhideWhenUsed/>
   </w:style>
   <w:style w:type="table" w:default="1" w:styleId="TableNormal">

</xml_diff>